<commit_message>
Record role foundation merge and verified Vercel source delivery
</commit_message>
<xml_diff>
--- a/docs/reports/2026-10-16-role-assignment-foundation.docx
+++ b/docs/reports/2026-10-16-role-assignment-foundation.docx
@@ -782,7 +782,7 @@
     </w:p>
     <w:p>
       <w:r>
-        <w:t>Review branch: codex/phase-1-role-assignments. Source commit, push/merge and current deployment evidence will be recorded after staged review. No phase is complete. Existing Production URL: https://virtual-ink.vercel.app. A Vercel build of source does not apply this SQL migration or verify hosted roles/MFA. Production private workflow acceptance remains open.</w:t>
+        <w:t>Source commit cff8b48409c8dbed6f97d32038d65f29a6335aec is committed and pushed on codex/phase-1-role-assignments, then fast-forward merged and pushed to main. Independent git ls-remote confirms the same source on both remote branches. Only the twenty reviewed source/test/report files were staged; staged diff validation passes and the user next-env.d.ts edit remains unstaged. Vercel's read-only deployment API confirms that exact source on main is READY in Production, deployment dpl_GNtAr8FUSxmhaAQ9g1iBabRdjmh9: https://virtual-34hls77jl-shadowrootsec-5679.vercel.app. Inspecting the alias https://virtual-ink.vercel.app resolves to that deployment. At 04:57 UTC, after that exact source became Ready, all twenty public-page/image/health/guest-denial smoke checks pass. These are not genuine Auth/role acceptance tests. A post-deployment hosted catalog read still shows ten migrations and no new assignment schema or reader. A Vercel source build does not apply SQL or verify genuine roles/MFA. No phase is complete; production private workflow acceptance remains open.</w:t>
       </w:r>
     </w:p>
     <w:p>
@@ -843,7 +843,7 @@
     </w:p>
     <w:p>
       <w:r>
-        <w:t>Word uses the established compact_reference_guide preset, memo_masthead and named report-style overrides. Structural document checks pass. Rendering was attempted and failed because LibreOffice is absent (WinError 2); visual pagination remains unverified. Link/privacy checks are recorded before delivery. Report delivery is not human signoff.</w:t>
+        <w:t>Word uses the established compact_reference_guide preset, memo_masthead and named report-style overrides. Structural document checks pass. Rendering was attempted and failed because LibreOffice is absent (WinError 2); visual pagination remains unverified. All 202 local links, identical portable/migration SQL bytes, required report evidence, OOXML and privacy checks pass. Report delivery is not human signoff.</w:t>
       </w:r>
     </w:p>
     <w:sectPr>

</xml_diff>